<commit_message>
Regenerate dev-mini with mention ground truth (spec-sanctioned waiver)
The frozen-fixture rule is deliberately waived for dev-mini only, per
the adopted backlog item. The recipe gains min_mentions_per_person: 1
with the seed unchanged; roster, engagement, and document identities
reproduce exactly (spot-verified against the prior ledger before
deletion). The fixture now carries mention_map.json, 46 planned
mentions across 11 authored docs, the ACL overlay for its open
posture, and visibility evals; it validates clean with MENT and GRAPH
rules running (skips only for charter-off knobs: AFF, EML, SCAN, LEG).

Additive-evolution compat tests rebase onto synthetic old-shape
artifacts (manifest line, charter, external person) instead of reading
dev-mini; the mention grandfather stays tested on a synthetic
mention-map-less org; the never-emitted-visibility exemplar moves to
torchlake. Re-authored through the airlock via forge-author workers.
</commit_message>
<xml_diff>
--- a/companies/dev-mini/Engagements/Foley Group/2022.02.03 - Status Report - Foley Group v2 FINAL.docx
+++ b/companies/dev-mini/Engagements/Foley Group/2022.02.03 - Status Report - Foley Group v2 FINAL.docx
@@ -7,12 +7,12 @@
         <w:pStyle w:val="Heading1"/>
       </w:pPr>
       <w:r>
-        <w:t>Status Report: Integration Support</w:t>
+        <w:t>Status Report: Integration Support for Foley Group</w:t>
       </w:r>
     </w:p>
     <w:p>
       <w:r>
-        <w:t>Status: on track, one watch item. The integration plan for Foley Group is holding its sequence, supplier negotiations are underway on confirmed volumes, and reporting alignment is in its final pass. The deferred revenue treatment remains open with the outside accountants and is the one item that could move the reporting milestone.</w:t>
+        <w:t>Prepared by Jenna Wiley, Principal Consultant, for the Foley Group executive team.</w:t>
       </w:r>
     </w:p>
     <w:p>
@@ -20,7 +20,20 @@
         <w:pStyle w:val="Heading2"/>
       </w:pPr>
       <w:r>
-        <w:t>Completed this period</w:t>
+        <w:t>Status summary</w:t>
+      </w:r>
+    </w:p>
+    <w:p>
+      <w:r>
+        <w:t>The engagement is on track. The integration checklist for the current phase is substantially complete, every open item has a named owner, and nothing before us requires an immediate decision from you. Two risks are worth your attention; both are described below.</w:t>
+      </w:r>
+    </w:p>
+    <w:p>
+      <w:pPr>
+        <w:pStyle w:val="Heading2"/>
+      </w:pPr>
+      <w:r>
+        <w:t>Accomplishments this period</w:t>
       </w:r>
     </w:p>
     <w:p>
@@ -28,7 +41,7 @@
         <w:pStyle w:val="ListBullet"/>
       </w:pPr>
       <w:r>
-        <w:t>Confirmed combined purchase volumes and opened negotiations with the top overlapping suppliers.</w:t>
+        <w:t>Closed the remaining back-office items from the prior phase of the integration checklist.</w:t>
       </w:r>
     </w:p>
     <w:p>
@@ -36,7 +49,7 @@
         <w:pStyle w:val="ListBullet"/>
       </w:pPr>
       <w:r>
-        <w:t>Completed the second-pass chart-of-accounts mapping; the combined business can produce a single trial balance.</w:t>
+        <w:t>Jacob Williams completed the consolidation summary; every figure in it now traces to a source document.</w:t>
       </w:r>
     </w:p>
     <w:p>
@@ -44,7 +57,15 @@
         <w:pStyle w:val="ListBullet"/>
       </w:pPr>
       <w:r>
-        <w:t>Ran the weekly operating rhythm without a missed session through the holiday period, which we count as a minor miracle.</w:t>
+        <w:t>Lisa Hernandez compiled the working-session record for the engagement to date, so the reasoning behind each decision is on paper.</w:t>
+      </w:r>
+    </w:p>
+    <w:p>
+      <w:pPr>
+        <w:pStyle w:val="ListBullet"/>
+      </w:pPr>
+      <w:r>
+        <w:t>Continued the regular working sessions with your management team.</w:t>
       </w:r>
     </w:p>
     <w:p>
@@ -52,7 +73,7 @@
         <w:pStyle w:val="Heading2"/>
       </w:pPr>
       <w:r>
-        <w:t>Upcoming</w:t>
+        <w:t>Upcoming work</w:t>
       </w:r>
     </w:p>
     <w:p>
@@ -60,7 +81,7 @@
         <w:pStyle w:val="ListBullet"/>
       </w:pPr>
       <w:r>
-        <w:t>Close out supplier terms for freight and packaging, where the consolidation gap is largest.</w:t>
+        <w:t>Begin the final phase of the integration checklist, covering the customer-facing functions.</w:t>
       </w:r>
     </w:p>
     <w:p>
@@ -68,7 +89,7 @@
         <w:pStyle w:val="ListBullet"/>
       </w:pPr>
       <w:r>
-        <w:t>First combined-calendar monthly close, with Pinebrook observing rather than driving.</w:t>
+        <w:t>Draft the closing report for the engagement, findings first, with recommendations your team can act on.</w:t>
       </w:r>
     </w:p>
     <w:p>
@@ -76,7 +97,31 @@
         <w:pStyle w:val="ListBullet"/>
       </w:pPr>
       <w:r>
-        <w:t>Steering session to review the exit checklist and transition remaining items to client owners.</w:t>
+        <w:t>Schedule the remaining working sessions through the end of the engagement.</w:t>
+      </w:r>
+    </w:p>
+    <w:p>
+      <w:pPr>
+        <w:pStyle w:val="Heading2"/>
+      </w:pPr>
+      <w:r>
+        <w:t>Risks</w:t>
+      </w:r>
+    </w:p>
+    <w:p>
+      <w:pPr>
+        <w:pStyle w:val="ListBullet"/>
+      </w:pPr>
+      <w:r>
+        <w:t>The combined staffing plan for one department is still unsettled. Until it settles, the affected checklist items cannot close.</w:t>
+      </w:r>
+    </w:p>
+    <w:p>
+      <w:pPr>
+        <w:pStyle w:val="ListBullet"/>
+      </w:pPr>
+      <w:r>
+        <w:t>Several open items depend on information held outside the working group. Delays there push the schedule directly.</w:t>
       </w:r>
     </w:p>
     <w:p>
@@ -89,7 +134,7 @@
     </w:p>
     <w:p>
       <w:r>
-        <w:t>The engagement remains within the agreed fixed fee of $44,500, invoiced monthly per the engagement letter. No scope changes this period; the deferred revenue question sits with the client's outside accountants and does not affect our fees.</w:t>
+        <w:t>Work performed to date is within the fixed fee of $44,500 set out in our engagement letter, and we expect to complete the engagement within it. Questions on any of the above can come to me directly.</w:t>
       </w:r>
     </w:p>
     <w:sectPr>

</xml_diff>